<commit_message>
chore(eval): re-render docx and latex of the South Carolina Supreme Court answering-brief on the merged model (fb-595.54.82)
Co-Authored-By: Claude Opus 5.5 <noreply@anthropic.com>
</commit_message>
<xml_diff>
--- a/courts/fourth-circuit/south-carolina/state/supreme-court/answering-brief/usage/OUTPUT-answering-brief.docx
+++ b/courts/fourth-circuit/south-carolina/state/supreme-court/answering-brief/usage/OUTPUT-answering-brief.docx
@@ -12682,7 +12682,7 @@
         <w:t xml:space="preserve"> </w:t>
       </w:r>
       <w:r>
-        <w:t xml:space="preserve">requirement that the “government service or program . . . benefits the [fee] payer in some manner different from the members of the general public.” …</w:t>
+        <w:t xml:space="preserve">requirement that the “government service or program ⁠. ⁠. ⁠. benefits the [fee] payer in some manner different from the members of the general public.” …</w:t>
       </w:r>
     </w:p>
     <w:p>
@@ -13536,7 +13536,7 @@
         <w:t xml:space="preserve"> </w:t>
       </w:r>
       <w:r>
-        <w:t xml:space="preserve">anchors this Court’s separation of powers precedent in cases involving the General Assembly’s attempt to retroactively overturn prior decisions of this Court. In that foundational decision, this Court held that “[u]nder our State Constitution which provides . . . for the separation of the legislative, executive and judicial powers of the government, the General Assembly does not have authority to [legislatively reverse a decision of the Supreme Court].” Lindsay,</w:t>
+        <w:t xml:space="preserve">anchors this Court’s separation of powers precedent in cases involving the General Assembly’s attempt to retroactively overturn prior decisions of this Court. In that foundational decision, this Court held that “[u]nder our State Constitution which provides ⁠. ⁠. ⁠. for the separation of the legislative, executive and judicial powers of the government, the General Assembly does not have authority to [legislatively reverse a decision of the Supreme Court].” Lindsay,</w:t>
       </w:r>
       <w:r>
         <w:t xml:space="preserve"> </w:t>
@@ -14731,7 +14731,7 @@
         <w:t xml:space="preserve"> </w:t>
       </w:r>
       <w:r>
-        <w:t xml:space="preserve">L.L.C. v. Town of Mount Pleasant, 338 S.C. 406, 419, 526 S.E.2d 716, 723 (2000) (“a respondent . . . may raise on appeal any additional reasons the appellate court should affirm the lower court’s ruling, regardless of whether those reasons have been presented to or ruled on by the lower court.”).</w:t>
+        <w:t xml:space="preserve">L.L.C. v. Town of Mount Pleasant, 338 S.C. 406, 419, 526 S.E.2d 716, 723 (2000) (“a respondent ⁠. ⁠. ⁠. may raise on appeal any additional reasons the appellate court should affirm the lower court’s ruling, regardless of whether those reasons have been presented to or ruled on by the lower court.”).</w:t>
       </w:r>
     </w:p>
     <w:p>
@@ -15689,7 +15689,7 @@
         <w:t xml:space="preserve"> </w:t>
       </w:r>
       <w:r>
-        <w:t xml:space="preserve">The Takings Clause is implicated “where private property is taken for public use by the State or by any of its agencies . . . or by a municipal corporation.” Smith v. City</w:t>
+        <w:t xml:space="preserve">The Takings Clause is implicated “where private property is taken for public use by the State or by any of its agencies ⁠. ⁠. ⁠. or by a municipal corporation.” Smith v. City</w:t>
       </w:r>
       <w:r>
         <w:t xml:space="preserve"> </w:t>
@@ -16924,13 +16924,19 @@
         <w:t xml:space="preserve"> </w:t>
       </w:r>
       <w:r>
-        <w:t xml:space="preserve">Specifically, the Complaint included an equitable claim for quantum meruit/⁠unjust enrichment against all Orangeburg Appellants; a claim against the Orangeburg County Administrator and Orangeburg County Treasurer for violation of S.C. Code Ann. § 8-⁠⁠21-⁠⁠30;</w:t>
-      </w:r>
-      <w:r>
-        <w:t xml:space="preserve"> </w:t>
-      </w:r>
-      <w:r>
-        <w:t xml:space="preserve">a claim against all Orangeburg Appellants for violation of the Due Process Clause of the South Carolina Constitution; and a claim for declaratory judgment. (R. pp. 267-⁠278).</w:t>
+        <w:t xml:space="preserve">Specifically, the Complaint included an equitable claim for quantum meruit/​unjust enrichment against all Orangeburg Appellants; a claim against the Orangeburg County Administrator and Orangeburg County Treasurer for violation of S.C. Code Ann. § 8-⁠21-⁠30;</w:t>
+      </w:r>
+      <w:r>
+        <w:t xml:space="preserve"> </w:t>
+      </w:r>
+      <w:r>
+        <w:t xml:space="preserve">a claim against all Orangeburg Appellants for violation of the Due Process Clause of the South Carolina Constitution; and a claim for declaratory judgment. (R. pp. 267</w:t>
+      </w:r>
+      <w:r>
+        <w:noBreakHyphen/>
+      </w:r>
+      <w:r>
+        <w:t xml:space="preserve">278).</w:t>
       </w:r>
     </w:p>
   </w:footnote>

</xml_diff>